<commit_message>
Changed "June" to "Jun"
</commit_message>
<xml_diff>
--- a/ms_word_files/MAGOLIMAN, JOSHUA C. - MY RESUME.docx
+++ b/ms_word_files/MAGOLIMAN, JOSHUA C. - MY RESUME.docx
@@ -2025,6 +2025,8 @@
         </w:rPr>
         <w:t>Experience</w:t>
       </w:r>
+      <w:bookmarkStart w:id="0" w:name="_GoBack"/>
+      <w:bookmarkEnd w:id="0"/>
     </w:p>
     <w:p>
       <w:pPr>
@@ -2200,7 +2202,13 @@
         <w:rPr>
           <w:b/>
         </w:rPr>
-        <w:t>June 05, 2026 (1 year and 1 month)</w:t>
+        <w:t>Jun</w:t>
+      </w:r>
+      <w:r>
+        <w:rPr>
+          <w:b/>
+        </w:rPr>
+        <w:t xml:space="preserve"> 05, 2026 (1 year and 1 month)</w:t>
       </w:r>
     </w:p>
     <w:p>
@@ -3124,8 +3132,6 @@
         </w:rPr>
         <w:t>Philippines)</w:t>
       </w:r>
-      <w:bookmarkStart w:id="0" w:name="_GoBack"/>
-      <w:bookmarkEnd w:id="0"/>
     </w:p>
     <w:p>
       <w:pPr>

</xml_diff>